<commit_message>
Rebuild the runbook .docx so it stops contradicting the Markdown
The Word file still said 13 contracted seats, omitted prodz entirely, claimed
two enabled routines were frozen rather than four, and presented pilot duration
and prospect cap as enforced limits. The Markdown had been corrected; the .docx
had not, so whichever file the owner opened decided what they believed.

Rebuilt with python-docx in a scratchpad virtualenv, deliberately not installed
into the unrelated venv that owns python on PATH, then read back and verified:
seven content checks covering every correction and both stale phrasings.

Co-Authored-By: Claude Opus 5 <noreply@anthropic.com>
</commit_message>
<xml_diff>
--- a/output/documents/agents-office-unattended-operation-runbook.docx
+++ b/output/documents/agents-office-unattended-operation-runbook.docx
@@ -645,7 +645,7 @@
               <w:rPr>
                 <w:sz w:val="16"/>
               </w:rPr>
-              <w:t>119 seats; 54 generic, 52 briefed, 13 contracted, 0 tested.</w:t>
+              <w:t>119 seats; 53 generic, 52 briefed, 14 contracted, 0 tested.</w:t>
             </w:r>
           </w:p>
         </w:tc>
@@ -669,7 +669,7 @@
               <w:rPr>
                 <w:sz w:val="16"/>
               </w:rPr>
-              <w:t>Owner reviews the 13 contracted seats before they run unattended.</w:t>
+              <w:t>Owner reviews the 14 contracted seats before they run unattended.</w:t>
             </w:r>
           </w:p>
         </w:tc>
@@ -871,7 +871,7 @@
               <w:rPr>
                 <w:sz w:val="16"/>
               </w:rPr>
-              <w:t>Inactive; four limits unset.</w:t>
+              <w:t>Inactive; four limits written from this runbook, awaiting owner confirmation.</w:t>
             </w:r>
           </w:p>
         </w:tc>
@@ -894,7 +894,7 @@
               <w:rPr>
                 <w:sz w:val="16"/>
               </w:rPr>
-              <w:t>Set limits and connect prospect research before activation.</w:t>
+              <w:t>Owner confirms the numbers and authorises Apollo before activation.</w:t>
             </w:r>
           </w:p>
         </w:tc>
@@ -947,7 +947,7 @@
               <w:rPr>
                 <w:sz w:val="16"/>
               </w:rPr>
-              <w:t>Inactive; two limits unset.</w:t>
+              <w:t>Inactive; cadence and findings limit written from this runbook, awaiting owner confirmation.</w:t>
             </w:r>
           </w:p>
         </w:tc>
@@ -971,7 +971,7 @@
               <w:rPr>
                 <w:sz w:val="16"/>
               </w:rPr>
-              <w:t>Set cadence and findings limit before activation.</w:t>
+              <w:t>Owner confirms the numbers before activation.</w:t>
             </w:r>
           </w:p>
         </w:tc>
@@ -2021,7 +2021,7 @@
               <w:rPr>
                 <w:sz w:val="16"/>
               </w:rPr>
-              <w:t>Pilot duration</w:t>
+              <w:t>Pilot duration (manual)</w:t>
             </w:r>
           </w:p>
         </w:tc>
@@ -2090,7 +2090,7 @@
               <w:rPr>
                 <w:sz w:val="16"/>
               </w:rPr>
-              <w:t>Enough time to observe routine and restart behavior.</w:t>
+              <w:t>No config field: the owner enforces this by ending the pilot.</w:t>
             </w:r>
           </w:p>
         </w:tc>
@@ -2119,7 +2119,7 @@
               <w:rPr>
                 <w:sz w:val="16"/>
               </w:rPr>
-              <w:t>Pilot prospect cap</w:t>
+              <w:t>Pilot prospect cap (manual)</w:t>
             </w:r>
           </w:p>
         </w:tc>
@@ -2191,7 +2191,7 @@
               <w:rPr>
                 <w:sz w:val="16"/>
               </w:rPr>
-              <w:t>Bounds real-world exposure.</w:t>
+              <w:t>No config field: only the four acquisition limits are enforced in code.</w:t>
             </w:r>
           </w:p>
         </w:tc>
@@ -2819,6 +2819,11 @@
     <w:p>
       <w:r>
         <w:t>Open work affects routine scheduling. Resolve it before the pilot so old drafts cannot be mistaken for fresh work.</w:t>
+      </w:r>
+    </w:p>
+    <w:p>
+      <w:r>
+        <w:t>This is not housekeeping. A routine has at most one open run, and every open state counts, "waiting" and "doing" alike. Four of the five enabled routines are frozen right now: outbound-first-touch, inbound-qualify and inbound-content by their waiting drafts since 17 September, and first-client-review by the CEO run interrupted on 18 September. Only prospect-list can still fire. first-client-review frees itself at the next start, when boot reconciles the interrupted run; the other three need an owner decision on each draft. The two stale reports carry no TO: recipient, so cancelling costs no Claude run while approving spends one on an outbound step with nothing to send. The Instagram draft is a different case: it is real content, and iggy has no Instagram or Meta connector at all, so approving it cannot post anything and would only spend a run restating the posts already drafted.</w:t>
       </w:r>
     </w:p>
     <w:tbl>
@@ -3560,7 +3565,7 @@
               <w:rPr>
                 <w:sz w:val="16"/>
               </w:rPr>
-              <w:t>Paused routine role</w:t>
+              <w:t>Paused routine roles</w:t>
             </w:r>
           </w:p>
         </w:tc>
@@ -3583,7 +3588,7 @@
               <w:rPr>
                 <w:sz w:val="16"/>
               </w:rPr>
-              <w:t>vertical</w:t>
+              <w:t>vertical, prodz</w:t>
             </w:r>
           </w:p>
         </w:tc>
@@ -3606,7 +3611,7 @@
               <w:rPr>
                 <w:sz w:val="16"/>
               </w:rPr>
-              <w:t>ICP changes remain proposals based on real replies and require owner review.</w:t>
+              <w:t>vertical: ICP changes remain proposals based on real replies and require owner review. prodz: offers are packaged, never priced — every figure comes from the offer ladder verbatim.</w:t>
             </w:r>
           </w:p>
         </w:tc>
@@ -3616,6 +3621,11 @@
       <w:pPr>
         <w:spacing w:after="20"/>
       </w:pPr>
+    </w:p>
+    <w:p>
+      <w:r>
+        <w:t>Both paused routine roles were contracted on 18 September and pass 3/3, so neither can run on its job title if its routine is later unpaused. Adding a capability contract promotes a seat to "contracted", which is the bar readiness.requireForOutbound uses to permit a send without an owner override: never add a contract without running that seat’s three fixtures in the same pass, or send authority widens with no evidence behind it.</w:t>
+      </w:r>
     </w:p>
     <w:p>
       <w:pPr>
@@ -3696,7 +3706,7 @@
         <w:t xml:space="preserve">☐  </w:t>
       </w:r>
       <w:r>
-        <w:t>All 13 contracted seats show tested.</w:t>
+        <w:t>All 14 contracted seats show tested.</w:t>
       </w:r>
     </w:p>
     <w:p>

</xml_diff>